<commit_message>
Added document regarding application and more info on user stories
</commit_message>
<xml_diff>
--- a/Documents/User Stories.docx
+++ b/Documents/User Stories.docx
@@ -373,6 +373,45 @@
     </w:p>
     <w:p>
       <w:pPr>
+        <w:pStyle w:val="ListParagraph"/>
+        <w:numPr>
+          <w:ilvl w:val="0"/>
+          <w:numId w:val="7"/>
+        </w:numPr>
+        <w:spacing w:line="360" w:lineRule="auto"/>
+        <w:rPr>
+          <w:rFonts w:ascii="Times New Roman" w:hAnsi="Times New Roman" w:cs="Times New Roman"/>
+          <w:i/>
+          <w:iCs/>
+        </w:rPr>
+      </w:pPr>
+      <w:r>
+        <w:rPr>
+          <w:rFonts w:ascii="Times New Roman" w:hAnsi="Times New Roman" w:cs="Times New Roman"/>
+          <w:i/>
+          <w:iCs/>
+        </w:rPr>
+        <w:t xml:space="preserve">“As a player, I want </w:t>
+      </w:r>
+      <w:r>
+        <w:rPr>
+          <w:rFonts w:ascii="Times New Roman" w:hAnsi="Times New Roman" w:cs="Times New Roman"/>
+          <w:i/>
+          <w:iCs/>
+        </w:rPr>
+        <w:t>to view instructions to understand how the game works.</w:t>
+      </w:r>
+      <w:r>
+        <w:rPr>
+          <w:rFonts w:ascii="Times New Roman" w:hAnsi="Times New Roman" w:cs="Times New Roman"/>
+          <w:i/>
+          <w:iCs/>
+        </w:rPr>
+        <w:t>”</w:t>
+      </w:r>
+    </w:p>
+    <w:p>
+      <w:pPr>
         <w:spacing w:line="360" w:lineRule="auto"/>
         <w:rPr>
           <w:rFonts w:ascii="Times New Roman" w:hAnsi="Times New Roman" w:cs="Times New Roman"/>
@@ -704,6 +743,7 @@
           <w:i/>
           <w:iCs/>
         </w:rPr>
+        <w:lastRenderedPageBreak/>
         <w:t>“</w:t>
       </w:r>
       <w:r>
@@ -740,7 +780,6 @@
           <w:szCs w:val="28"/>
           <w:u w:val="single"/>
         </w:rPr>
-        <w:lastRenderedPageBreak/>
         <w:t>Game Features</w:t>
       </w:r>
     </w:p>
@@ -890,6 +929,193 @@
           <w:iCs/>
         </w:rPr>
         <w:t>As a player, I want my final result to be stored after playing so that it can be reviewed later.</w:t>
+      </w:r>
+      <w:r>
+        <w:rPr>
+          <w:rFonts w:ascii="Times New Roman" w:hAnsi="Times New Roman" w:cs="Times New Roman"/>
+          <w:i/>
+          <w:iCs/>
+        </w:rPr>
+        <w:t>”</w:t>
+      </w:r>
+    </w:p>
+    <w:p>
+      <w:pPr>
+        <w:pStyle w:val="ListParagraph"/>
+        <w:numPr>
+          <w:ilvl w:val="0"/>
+          <w:numId w:val="5"/>
+        </w:numPr>
+        <w:spacing w:line="360" w:lineRule="auto"/>
+        <w:rPr>
+          <w:rFonts w:ascii="Times New Roman" w:hAnsi="Times New Roman" w:cs="Times New Roman"/>
+          <w:i/>
+          <w:iCs/>
+        </w:rPr>
+      </w:pPr>
+      <w:r>
+        <w:rPr>
+          <w:rFonts w:ascii="Times New Roman" w:hAnsi="Times New Roman" w:cs="Times New Roman"/>
+          <w:i/>
+          <w:iCs/>
+        </w:rPr>
+        <w:t>“As a player, I want to buy upgrades, so that each click gives me more points.”</w:t>
+      </w:r>
+    </w:p>
+    <w:p>
+      <w:pPr>
+        <w:pStyle w:val="ListParagraph"/>
+        <w:numPr>
+          <w:ilvl w:val="0"/>
+          <w:numId w:val="5"/>
+        </w:numPr>
+        <w:spacing w:line="360" w:lineRule="auto"/>
+        <w:rPr>
+          <w:rFonts w:ascii="Times New Roman" w:hAnsi="Times New Roman" w:cs="Times New Roman"/>
+          <w:i/>
+          <w:iCs/>
+        </w:rPr>
+      </w:pPr>
+      <w:r>
+        <w:rPr>
+          <w:rFonts w:ascii="Times New Roman" w:hAnsi="Times New Roman" w:cs="Times New Roman"/>
+          <w:i/>
+          <w:iCs/>
+        </w:rPr>
+        <w:t>“</w:t>
+      </w:r>
+      <w:r>
+        <w:rPr>
+          <w:rFonts w:ascii="Times New Roman" w:hAnsi="Times New Roman" w:cs="Times New Roman"/>
+          <w:i/>
+          <w:iCs/>
+        </w:rPr>
+        <w:t xml:space="preserve">As a player, I want to see </w:t>
+      </w:r>
+      <w:r>
+        <w:rPr>
+          <w:rFonts w:ascii="Times New Roman" w:hAnsi="Times New Roman" w:cs="Times New Roman"/>
+          <w:i/>
+          <w:iCs/>
+        </w:rPr>
+        <w:t>the cost of each upgrade, so that I can decide what to buy next.</w:t>
+      </w:r>
+      <w:r>
+        <w:rPr>
+          <w:rFonts w:ascii="Times New Roman" w:hAnsi="Times New Roman" w:cs="Times New Roman"/>
+          <w:i/>
+          <w:iCs/>
+        </w:rPr>
+        <w:t>”</w:t>
+      </w:r>
+    </w:p>
+    <w:p>
+      <w:pPr>
+        <w:pStyle w:val="ListParagraph"/>
+        <w:numPr>
+          <w:ilvl w:val="0"/>
+          <w:numId w:val="5"/>
+        </w:numPr>
+        <w:spacing w:line="360" w:lineRule="auto"/>
+        <w:rPr>
+          <w:rFonts w:ascii="Times New Roman" w:hAnsi="Times New Roman" w:cs="Times New Roman"/>
+          <w:i/>
+          <w:iCs/>
+        </w:rPr>
+      </w:pPr>
+      <w:r>
+        <w:rPr>
+          <w:rFonts w:ascii="Times New Roman" w:hAnsi="Times New Roman" w:cs="Times New Roman"/>
+          <w:i/>
+          <w:iCs/>
+        </w:rPr>
+        <w:t>“As a player, I want to see my click power, so that I understand how much</w:t>
+      </w:r>
+      <w:r>
+        <w:rPr>
+          <w:rFonts w:ascii="Times New Roman" w:hAnsi="Times New Roman" w:cs="Times New Roman"/>
+          <w:i/>
+          <w:iCs/>
+        </w:rPr>
+        <w:t xml:space="preserve"> progress each click gives me.</w:t>
+      </w:r>
+      <w:r>
+        <w:rPr>
+          <w:rFonts w:ascii="Times New Roman" w:hAnsi="Times New Roman" w:cs="Times New Roman"/>
+          <w:i/>
+          <w:iCs/>
+        </w:rPr>
+        <w:t>”</w:t>
+      </w:r>
+    </w:p>
+    <w:p>
+      <w:pPr>
+        <w:pStyle w:val="ListParagraph"/>
+        <w:numPr>
+          <w:ilvl w:val="0"/>
+          <w:numId w:val="5"/>
+        </w:numPr>
+        <w:spacing w:line="360" w:lineRule="auto"/>
+        <w:rPr>
+          <w:rFonts w:ascii="Times New Roman" w:hAnsi="Times New Roman" w:cs="Times New Roman"/>
+          <w:i/>
+          <w:iCs/>
+        </w:rPr>
+      </w:pPr>
+      <w:r>
+        <w:rPr>
+          <w:rFonts w:ascii="Times New Roman" w:hAnsi="Times New Roman" w:cs="Times New Roman"/>
+          <w:i/>
+          <w:iCs/>
+        </w:rPr>
+        <w:t>“As a player, I want to rest</w:t>
+      </w:r>
+      <w:r>
+        <w:rPr>
+          <w:rFonts w:ascii="Times New Roman" w:hAnsi="Times New Roman" w:cs="Times New Roman"/>
+          <w:i/>
+          <w:iCs/>
+        </w:rPr>
+        <w:t>art the game, so that I can begin again if I want.</w:t>
+      </w:r>
+      <w:r>
+        <w:rPr>
+          <w:rFonts w:ascii="Times New Roman" w:hAnsi="Times New Roman" w:cs="Times New Roman"/>
+          <w:i/>
+          <w:iCs/>
+        </w:rPr>
+        <w:t>”</w:t>
+      </w:r>
+    </w:p>
+    <w:p>
+      <w:pPr>
+        <w:pStyle w:val="ListParagraph"/>
+        <w:numPr>
+          <w:ilvl w:val="0"/>
+          <w:numId w:val="5"/>
+        </w:numPr>
+        <w:spacing w:line="360" w:lineRule="auto"/>
+        <w:rPr>
+          <w:rFonts w:ascii="Times New Roman" w:hAnsi="Times New Roman" w:cs="Times New Roman"/>
+          <w:i/>
+          <w:iCs/>
+        </w:rPr>
+      </w:pPr>
+      <w:r>
+        <w:rPr>
+          <w:rFonts w:ascii="Times New Roman" w:hAnsi="Times New Roman" w:cs="Times New Roman"/>
+          <w:i/>
+          <w:iCs/>
+        </w:rPr>
+        <w:t xml:space="preserve">“As a player, I want to save </w:t>
+      </w:r>
+      <w:r>
+        <w:rPr>
+          <w:rFonts w:ascii="Times New Roman" w:hAnsi="Times New Roman" w:cs="Times New Roman"/>
+          <w:i/>
+          <w:iCs/>
+        </w:rPr>
+        <w:t>my progress in the future, so that I do not lose my game data.</w:t>
       </w:r>
       <w:r>
         <w:rPr>

</xml_diff>

<commit_message>
Updated files to using bootstrap for styling and added google fonts to the project
</commit_message>
<xml_diff>
--- a/Documents/User Stories.docx
+++ b/Documents/User Stories.docx
@@ -1264,6 +1264,33 @@
       </w:r>
     </w:p>
     <w:p/>
+    <w:p>
+      <w:r>
+        <w:t>**</w:t>
+      </w:r>
+      <w:r>
+        <w:t xml:space="preserve"> add more info, be more explicit</w:t>
+      </w:r>
+    </w:p>
+    <w:p>
+      <w:r>
+        <w:t>**</w:t>
+      </w:r>
+      <w:r>
+        <w:t xml:space="preserve"> </w:t>
+      </w:r>
+      <w:r>
+        <w:t xml:space="preserve">but not </w:t>
+      </w:r>
+      <w:proofErr w:type="spellStart"/>
+      <w:r>
+        <w:t>ui</w:t>
+      </w:r>
+      <w:proofErr w:type="spellEnd"/>
+      <w:r>
+        <w:t xml:space="preserve"> level</w:t>
+      </w:r>
+    </w:p>
     <w:sectPr>
       <w:pgSz w:w="12240" w:h="15840"/>
       <w:pgMar w:top="720" w:right="720" w:bottom="720" w:left="720" w:header="720" w:footer="720" w:gutter="0"/>

</xml_diff>

<commit_message>
Deleting commented css and adding info on user stories
</commit_message>
<xml_diff>
--- a/Documents/User Stories.docx
+++ b/Documents/User Stories.docx
@@ -352,23 +352,15 @@
           <w:i/>
           <w:iCs/>
         </w:rPr>
-        <w:t>“</w:t>
-      </w:r>
-      <w:r>
-        <w:rPr>
-          <w:rFonts w:ascii="Times New Roman" w:hAnsi="Times New Roman" w:cs="Times New Roman"/>
-          <w:i/>
-          <w:iCs/>
-        </w:rPr>
-        <w:t>As a player, I want to log out securely so that no one else can access my account on the same device.</w:t>
-      </w:r>
-      <w:r>
-        <w:rPr>
-          <w:rFonts w:ascii="Times New Roman" w:hAnsi="Times New Roman" w:cs="Times New Roman"/>
-          <w:i/>
-          <w:iCs/>
-        </w:rPr>
-        <w:t>”</w:t>
+        <w:t>“As a player, I want to log out securely so that my active session is ended and no one else using the same device can access my saved progress, results, or personal account information.”</w:t>
+      </w:r>
+      <w:r>
+        <w:rPr>
+          <w:rFonts w:ascii="Times New Roman" w:hAnsi="Times New Roman" w:cs="Times New Roman"/>
+          <w:i/>
+          <w:iCs/>
+        </w:rPr>
+        <w:t xml:space="preserve"> </w:t>
       </w:r>
     </w:p>
     <w:p>
@@ -704,45 +696,6 @@
           <w:i/>
           <w:iCs/>
         </w:rPr>
-        <w:t>“</w:t>
-      </w:r>
-      <w:r>
-        <w:rPr>
-          <w:rFonts w:ascii="Times New Roman" w:hAnsi="Times New Roman" w:cs="Times New Roman"/>
-          <w:i/>
-          <w:iCs/>
-        </w:rPr>
-        <w:t>As an administrator, I want to search for a player account so that I can find information quickly.</w:t>
-      </w:r>
-      <w:r>
-        <w:rPr>
-          <w:rFonts w:ascii="Times New Roman" w:hAnsi="Times New Roman" w:cs="Times New Roman"/>
-          <w:i/>
-          <w:iCs/>
-        </w:rPr>
-        <w:t>”</w:t>
-      </w:r>
-    </w:p>
-    <w:p>
-      <w:pPr>
-        <w:pStyle w:val="ListParagraph"/>
-        <w:numPr>
-          <w:ilvl w:val="0"/>
-          <w:numId w:val="4"/>
-        </w:numPr>
-        <w:spacing w:line="360" w:lineRule="auto"/>
-        <w:rPr>
-          <w:rFonts w:ascii="Times New Roman" w:hAnsi="Times New Roman" w:cs="Times New Roman"/>
-          <w:i/>
-          <w:iCs/>
-        </w:rPr>
-      </w:pPr>
-      <w:r>
-        <w:rPr>
-          <w:rFonts w:ascii="Times New Roman" w:hAnsi="Times New Roman" w:cs="Times New Roman"/>
-          <w:i/>
-          <w:iCs/>
-        </w:rPr>
         <w:lastRenderedPageBreak/>
         <w:t>“</w:t>
       </w:r>
@@ -752,7 +705,54 @@
           <w:i/>
           <w:iCs/>
         </w:rPr>
-        <w:t>As an administrator, I want to log out securely so that sensitive account information stays protected.</w:t>
+        <w:t>As an administrator, I want to search for a player account so that I can find information quickly.</w:t>
+      </w:r>
+      <w:r>
+        <w:rPr>
+          <w:rFonts w:ascii="Times New Roman" w:hAnsi="Times New Roman" w:cs="Times New Roman"/>
+          <w:i/>
+          <w:iCs/>
+        </w:rPr>
+        <w:t>”</w:t>
+      </w:r>
+    </w:p>
+    <w:p>
+      <w:pPr>
+        <w:pStyle w:val="ListParagraph"/>
+        <w:numPr>
+          <w:ilvl w:val="0"/>
+          <w:numId w:val="4"/>
+        </w:numPr>
+        <w:spacing w:line="360" w:lineRule="auto"/>
+        <w:rPr>
+          <w:rFonts w:ascii="Times New Roman" w:hAnsi="Times New Roman" w:cs="Times New Roman"/>
+          <w:i/>
+          <w:iCs/>
+        </w:rPr>
+      </w:pPr>
+      <w:r>
+        <w:rPr>
+          <w:rFonts w:ascii="Times New Roman" w:hAnsi="Times New Roman" w:cs="Times New Roman"/>
+          <w:i/>
+          <w:iCs/>
+        </w:rPr>
+        <w:t>“</w:t>
+      </w:r>
+      <w:r>
+        <w:rPr>
+          <w:rFonts w:ascii="Times New Roman" w:hAnsi="Times New Roman" w:cs="Times New Roman"/>
+          <w:i/>
+          <w:iCs/>
+        </w:rPr>
+        <w:t xml:space="preserve">As an administrator, </w:t>
+      </w:r>
+      <w:r>
+        <w:rPr>
+          <w:rFonts w:ascii="Times New Roman" w:hAnsi="Times New Roman" w:cs="Times New Roman"/>
+          <w:i/>
+          <w:iCs/>
+        </w:rPr>
+        <w:t>the system should remove access to all administrator-only functions and require administrator authentication again before any protected user or results data can be viewed.</w:t>
       </w:r>
       <w:r>
         <w:rPr>
@@ -1263,32 +1263,73 @@
         <w:t>”</w:t>
       </w:r>
     </w:p>
-    <w:p/>
-    <w:p>
-      <w:r>
-        <w:t>**</w:t>
-      </w:r>
-      <w:r>
-        <w:t xml:space="preserve"> add more info, be more explicit</w:t>
-      </w:r>
-    </w:p>
-    <w:p>
-      <w:r>
-        <w:t>**</w:t>
-      </w:r>
-      <w:r>
-        <w:t xml:space="preserve"> </w:t>
-      </w:r>
-      <w:r>
-        <w:t xml:space="preserve">but not </w:t>
-      </w:r>
-      <w:proofErr w:type="spellStart"/>
-      <w:r>
-        <w:t>ui</w:t>
-      </w:r>
-      <w:proofErr w:type="spellEnd"/>
-      <w:r>
-        <w:t xml:space="preserve"> level</w:t>
+    <w:p>
+      <w:pPr>
+        <w:pStyle w:val="ListParagraph"/>
+        <w:numPr>
+          <w:ilvl w:val="0"/>
+          <w:numId w:val="6"/>
+        </w:numPr>
+        <w:spacing w:line="360" w:lineRule="auto"/>
+        <w:rPr>
+          <w:rFonts w:ascii="Times New Roman" w:hAnsi="Times New Roman" w:cs="Times New Roman"/>
+          <w:i/>
+          <w:iCs/>
+        </w:rPr>
+      </w:pPr>
+      <w:r>
+        <w:rPr>
+          <w:rFonts w:ascii="Times New Roman" w:hAnsi="Times New Roman" w:cs="Times New Roman"/>
+          <w:i/>
+          <w:iCs/>
+        </w:rPr>
+        <w:t>“As a system owner, I want the system to fully clear a user’s active login session when they log out so that protected pages cannot be accessed again without logging in.”</w:t>
+      </w:r>
+    </w:p>
+    <w:p>
+      <w:pPr>
+        <w:pStyle w:val="ListParagraph"/>
+        <w:numPr>
+          <w:ilvl w:val="0"/>
+          <w:numId w:val="6"/>
+        </w:numPr>
+        <w:spacing w:line="360" w:lineRule="auto"/>
+        <w:rPr>
+          <w:rFonts w:ascii="Times New Roman" w:hAnsi="Times New Roman" w:cs="Times New Roman"/>
+          <w:i/>
+          <w:iCs/>
+        </w:rPr>
+      </w:pPr>
+      <w:r>
+        <w:rPr>
+          <w:rFonts w:ascii="Times New Roman" w:hAnsi="Times New Roman" w:cs="Times New Roman"/>
+          <w:i/>
+          <w:iCs/>
+        </w:rPr>
+        <w:t>“As a registered player, I want to log out securely from my account so that my saved game progress, score history, and personal account information cannot be accessed by another person using the same device.” </w:t>
+      </w:r>
+    </w:p>
+    <w:p>
+      <w:pPr>
+        <w:pStyle w:val="ListParagraph"/>
+        <w:numPr>
+          <w:ilvl w:val="0"/>
+          <w:numId w:val="6"/>
+        </w:numPr>
+        <w:spacing w:line="360" w:lineRule="auto"/>
+        <w:rPr>
+          <w:rFonts w:ascii="Times New Roman" w:hAnsi="Times New Roman" w:cs="Times New Roman"/>
+          <w:i/>
+          <w:iCs/>
+        </w:rPr>
+      </w:pPr>
+      <w:r>
+        <w:rPr>
+          <w:rFonts w:ascii="Times New Roman" w:hAnsi="Times New Roman" w:cs="Times New Roman"/>
+          <w:i/>
+          <w:iCs/>
+        </w:rPr>
+        <w:t>“As an administrator, I want to log out securely from the administrator account so that player records, account management functions, and sensitive system information remain protected after I finish using the system.” </w:t>
       </w:r>
     </w:p>
     <w:sectPr>
@@ -2551,7 +2592,6 @@
   <w:style w:type="character" w:default="1" w:styleId="DefaultParagraphFont">
     <w:name w:val="Default Paragraph Font"/>
     <w:uiPriority w:val="1"/>
-    <w:semiHidden/>
     <w:unhideWhenUsed/>
   </w:style>
   <w:style w:type="table" w:default="1" w:styleId="TableNormal">

</xml_diff>